<commit_message>
feat: improve readme file
</commit_message>
<xml_diff>
--- a/DwiputraSamMulia_ProjectDesignDocSpecificationV2 1.docx
+++ b/DwiputraSamMulia_ProjectDesignDocSpecificationV2 1.docx
@@ -401,6 +401,13 @@
                 <w:szCs w:val="20"/>
               </w:rPr>
             </w:pPr>
+            <w:r>
+              <w:rPr>
+                <w:sz w:val="20"/>
+                <w:szCs w:val="20"/>
+              </w:rPr>
+              <w:t>Y</w:t>
+            </w:r>
           </w:p>
         </w:tc>
         <w:tc>
@@ -698,6 +705,13 @@
                 <w:szCs w:val="20"/>
               </w:rPr>
             </w:pPr>
+            <w:r>
+              <w:rPr>
+                <w:sz w:val="20"/>
+                <w:szCs w:val="20"/>
+              </w:rPr>
+              <w:t>Y</w:t>
+            </w:r>
           </w:p>
         </w:tc>
         <w:tc>
@@ -838,6 +852,13 @@
                 <w:szCs w:val="20"/>
               </w:rPr>
             </w:pPr>
+            <w:r>
+              <w:rPr>
+                <w:sz w:val="20"/>
+                <w:szCs w:val="20"/>
+              </w:rPr>
+              <w:t>Y</w:t>
+            </w:r>
           </w:p>
         </w:tc>
         <w:tc>
@@ -1026,6 +1047,13 @@
                 <w:szCs w:val="20"/>
               </w:rPr>
             </w:pPr>
+            <w:r>
+              <w:rPr>
+                <w:sz w:val="20"/>
+                <w:szCs w:val="20"/>
+              </w:rPr>
+              <w:t>Y</w:t>
+            </w:r>
           </w:p>
         </w:tc>
         <w:tc>
@@ -1215,6 +1243,13 @@
                 <w:szCs w:val="20"/>
               </w:rPr>
             </w:pPr>
+            <w:r>
+              <w:rPr>
+                <w:sz w:val="20"/>
+                <w:szCs w:val="20"/>
+              </w:rPr>
+              <w:t>Y</w:t>
+            </w:r>
           </w:p>
         </w:tc>
         <w:tc>
@@ -1411,6 +1446,13 @@
                 <w:szCs w:val="20"/>
               </w:rPr>
             </w:pPr>
+            <w:r>
+              <w:rPr>
+                <w:sz w:val="20"/>
+                <w:szCs w:val="20"/>
+              </w:rPr>
+              <w:t>Y</w:t>
+            </w:r>
           </w:p>
         </w:tc>
         <w:tc>
@@ -1706,6 +1748,13 @@
                 <w:szCs w:val="20"/>
               </w:rPr>
             </w:pPr>
+            <w:r>
+              <w:rPr>
+                <w:sz w:val="20"/>
+                <w:szCs w:val="20"/>
+              </w:rPr>
+              <w:t>Y</w:t>
+            </w:r>
           </w:p>
         </w:tc>
         <w:tc>
@@ -1835,6 +1884,13 @@
                 <w:szCs w:val="20"/>
               </w:rPr>
             </w:pPr>
+            <w:r>
+              <w:rPr>
+                <w:sz w:val="20"/>
+                <w:szCs w:val="20"/>
+              </w:rPr>
+              <w:t>Y</w:t>
+            </w:r>
           </w:p>
         </w:tc>
         <w:tc>
@@ -1977,6 +2033,13 @@
                 <w:szCs w:val="20"/>
               </w:rPr>
             </w:pPr>
+            <w:r>
+              <w:rPr>
+                <w:sz w:val="20"/>
+                <w:szCs w:val="20"/>
+              </w:rPr>
+              <w:t>Y</w:t>
+            </w:r>
           </w:p>
         </w:tc>
         <w:tc>
@@ -2242,6 +2305,13 @@
                 <w:szCs w:val="20"/>
               </w:rPr>
             </w:pPr>
+            <w:r>
+              <w:rPr>
+                <w:sz w:val="20"/>
+                <w:szCs w:val="20"/>
+              </w:rPr>
+              <w:t>Y</w:t>
+            </w:r>
           </w:p>
         </w:tc>
         <w:tc>
@@ -2361,6 +2431,13 @@
                 <w:szCs w:val="20"/>
               </w:rPr>
             </w:pPr>
+            <w:r>
+              <w:rPr>
+                <w:sz w:val="20"/>
+                <w:szCs w:val="20"/>
+              </w:rPr>
+              <w:t>Y</w:t>
+            </w:r>
           </w:p>
         </w:tc>
         <w:tc>
@@ -2766,6 +2843,13 @@
                 <w:szCs w:val="20"/>
               </w:rPr>
             </w:pPr>
+            <w:r>
+              <w:rPr>
+                <w:sz w:val="20"/>
+                <w:szCs w:val="20"/>
+              </w:rPr>
+              <w:t>Y</w:t>
+            </w:r>
           </w:p>
         </w:tc>
         <w:tc>
@@ -9497,13 +9581,12 @@
 </file>
 
 <file path=customXml/item1.xml><?xml version="1.0" encoding="utf-8"?>
-<p:properties xmlns:p="http://schemas.microsoft.com/office/2006/metadata/properties" xmlns:xsi="http://www.w3.org/2001/XMLSchema-instance" xmlns:pc="http://schemas.microsoft.com/office/infopath/2007/PartnerControls">
-  <documentManagement>
-    <lcf76f155ced4ddcb4097134ff3c332f xmlns="80b0f7da-1e87-40b3-b158-d396c7df4e03">
-      <Terms xmlns="http://schemas.microsoft.com/office/infopath/2007/PartnerControls"/>
-    </lcf76f155ced4ddcb4097134ff3c332f>
-  </documentManagement>
-</p:properties>
+<?mso-contentType ?>
+<FormTemplates xmlns="http://schemas.microsoft.com/sharepoint/v3/contenttype/forms">
+  <Display>DocumentLibraryForm</Display>
+  <Edit>DocumentLibraryForm</Edit>
+  <New>DocumentLibraryForm</New>
+</FormTemplates>
 </file>
 
 <file path=customXml/item2.xml><?xml version="1.0" encoding="utf-8"?>
@@ -9712,12 +9795,13 @@
 </file>
 
 <file path=customXml/item3.xml><?xml version="1.0" encoding="utf-8"?>
-<?mso-contentType ?>
-<FormTemplates xmlns="http://schemas.microsoft.com/sharepoint/v3/contenttype/forms">
-  <Display>DocumentLibraryForm</Display>
-  <Edit>DocumentLibraryForm</Edit>
-  <New>DocumentLibraryForm</New>
-</FormTemplates>
+<p:properties xmlns:p="http://schemas.microsoft.com/office/2006/metadata/properties" xmlns:xsi="http://www.w3.org/2001/XMLSchema-instance" xmlns:pc="http://schemas.microsoft.com/office/infopath/2007/PartnerControls">
+  <documentManagement>
+    <lcf76f155ced4ddcb4097134ff3c332f xmlns="80b0f7da-1e87-40b3-b158-d396c7df4e03">
+      <Terms xmlns="http://schemas.microsoft.com/office/infopath/2007/PartnerControls"/>
+    </lcf76f155ced4ddcb4097134ff3c332f>
+  </documentManagement>
+</p:properties>
 </file>
 
 <file path=customXml/item4.xml><?xml version="1.0" encoding="utf-8"?>
@@ -9725,11 +9809,9 @@
 </file>
 
 <file path=customXml/itemProps1.xml><?xml version="1.0" encoding="utf-8"?>
-<ds:datastoreItem xmlns:ds="http://schemas.openxmlformats.org/officeDocument/2006/customXml" ds:itemID="{08B3675E-7673-4C1C-9702-2546EA66ACED}">
+<ds:datastoreItem xmlns:ds="http://schemas.openxmlformats.org/officeDocument/2006/customXml" ds:itemID="{032EDE66-2ED9-44CD-9CD8-EC548E3EDD67}">
   <ds:schemaRefs>
-    <ds:schemaRef ds:uri="http://schemas.microsoft.com/office/2006/metadata/properties"/>
-    <ds:schemaRef ds:uri="http://schemas.microsoft.com/office/infopath/2007/PartnerControls"/>
-    <ds:schemaRef ds:uri="80b0f7da-1e87-40b3-b158-d396c7df4e03"/>
+    <ds:schemaRef ds:uri="http://schemas.microsoft.com/sharepoint/v3/contenttype/forms"/>
   </ds:schemaRefs>
 </ds:datastoreItem>
 </file>
@@ -9754,9 +9836,11 @@
 </file>
 
 <file path=customXml/itemProps3.xml><?xml version="1.0" encoding="utf-8"?>
-<ds:datastoreItem xmlns:ds="http://schemas.openxmlformats.org/officeDocument/2006/customXml" ds:itemID="{032EDE66-2ED9-44CD-9CD8-EC548E3EDD67}">
+<ds:datastoreItem xmlns:ds="http://schemas.openxmlformats.org/officeDocument/2006/customXml" ds:itemID="{08B3675E-7673-4C1C-9702-2546EA66ACED}">
   <ds:schemaRefs>
-    <ds:schemaRef ds:uri="http://schemas.microsoft.com/sharepoint/v3/contenttype/forms"/>
+    <ds:schemaRef ds:uri="http://schemas.microsoft.com/office/2006/metadata/properties"/>
+    <ds:schemaRef ds:uri="http://schemas.microsoft.com/office/infopath/2007/PartnerControls"/>
+    <ds:schemaRef ds:uri="80b0f7da-1e87-40b3-b158-d396c7df4e03"/>
   </ds:schemaRefs>
 </ds:datastoreItem>
 </file>

</xml_diff>